<commit_message>
Output Doc Format changes
</commit_message>
<xml_diff>
--- a/btb_cvs_support/document/templates/boq.docx
+++ b/btb_cvs_support/document/templates/boq.docx
@@ -636,136 +636,56 @@
     <w:p>
       <w:pPr>
         <w:rPr>
-          <w:rFonts w:cstheme="minorHAnsi"/>
-          <w:sz w:val="20"/>
-          <w:szCs w:val="20"/>
+          <w:rFonts w:ascii="Arial" w:hAnsi="Arial"/>
         </w:rPr>
       </w:pPr>
       <w:r>
         <w:rPr>
-          <w:rFonts w:cstheme="minorHAnsi"/>
-          <w:sz w:val="20"/>
-          <w:szCs w:val="20"/>
+          <w:rFonts w:ascii="Helvetica Neue" w:hAnsi="Helvetica Neue" w:cs="Arial"/>
+          <w:sz w:val="18"/>
+          <w:szCs w:val="18"/>
+          <w:lang w:val="en-US"/>
         </w:rPr>
         <w:t>[[</w:t>
       </w:r>
-      <w:r>
-        <w:rPr>
-          <w:rFonts w:cstheme="minorHAnsi"/>
-          <w:sz w:val="20"/>
-          <w:szCs w:val="20"/>
-        </w:rPr>
-        <w:t xml:space="preserve">if </w:t>
-      </w:r>
       <w:proofErr w:type="spellStart"/>
       <w:r>
         <w:rPr>
-          <w:rFonts w:cstheme="minorHAnsi"/>
-          <w:sz w:val="20"/>
-          <w:szCs w:val="20"/>
-        </w:rPr>
-        <w:t>eq</w:t>
+          <w:rFonts w:ascii="Helvetica Neue" w:hAnsi="Helvetica Neue" w:cs="Arial"/>
+          <w:sz w:val="18"/>
+          <w:szCs w:val="18"/>
+          <w:lang w:val="en-US"/>
+        </w:rPr>
+        <w:t>wmtext</w:t>
       </w:r>
       <w:proofErr w:type="spellEnd"/>
       <w:r>
         <w:rPr>
-          <w:rFonts w:cstheme="minorHAnsi"/>
-          <w:sz w:val="20"/>
-          <w:szCs w:val="20"/>
-        </w:rPr>
-        <w:t xml:space="preserve"> </w:t>
-      </w:r>
-      <w:r>
-        <w:rPr>
-          <w:rFonts w:cstheme="minorHAnsi"/>
-          <w:sz w:val="20"/>
-          <w:szCs w:val="20"/>
-        </w:rPr>
-        <w:t>.</w:t>
-      </w:r>
-      <w:proofErr w:type="spellStart"/>
-      <w:r>
-        <w:rPr>
-          <w:rFonts w:cstheme="minorHAnsi"/>
-          <w:sz w:val="20"/>
-          <w:szCs w:val="20"/>
-        </w:rPr>
-        <w:t>qt.status</w:t>
-      </w:r>
-      <w:proofErr w:type="spellEnd"/>
-      <w:r>
-        <w:rPr>
-          <w:rFonts w:cstheme="minorHAnsi"/>
-          <w:sz w:val="20"/>
-          <w:szCs w:val="20"/>
-        </w:rPr>
-        <w:t xml:space="preserve"> “</w:t>
-      </w:r>
-      <w:r>
-        <w:rPr>
-          <w:rFonts w:cstheme="minorHAnsi"/>
-          <w:sz w:val="20"/>
-          <w:szCs w:val="20"/>
-        </w:rPr>
-        <w:t>Approved</w:t>
-      </w:r>
-      <w:r>
-        <w:rPr>
-          <w:rFonts w:cstheme="minorHAnsi"/>
-          <w:sz w:val="20"/>
-          <w:szCs w:val="20"/>
-        </w:rPr>
-        <w:t>”</w:t>
-      </w:r>
-      <w:r>
-        <w:rPr>
-          <w:rFonts w:cstheme="minorHAnsi"/>
-          <w:sz w:val="20"/>
-          <w:szCs w:val="20"/>
+          <w:rFonts w:ascii="Helvetica Neue" w:hAnsi="Helvetica Neue" w:cs="Arial"/>
+          <w:sz w:val="18"/>
+          <w:szCs w:val="18"/>
+          <w:lang w:val="en-US"/>
+        </w:rPr>
+        <w:t xml:space="preserve"> .qt.</w:t>
+      </w:r>
+      <w:r>
+        <w:rPr>
+          <w:rFonts w:ascii="Helvetica Neue" w:hAnsi="Helvetica Neue" w:cs="Arial"/>
+          <w:sz w:val="18"/>
+          <w:szCs w:val="18"/>
+          <w:lang w:val="en-US"/>
+        </w:rPr>
+        <w:t>water_mark</w:t>
+      </w:r>
+      <w:r>
+        <w:rPr>
+          <w:rFonts w:ascii="Helvetica Neue" w:hAnsi="Helvetica Neue" w:cs="Arial"/>
+          <w:sz w:val="18"/>
+          <w:szCs w:val="18"/>
+          <w:lang w:val="en-US"/>
         </w:rPr>
         <w:t>]]</w:t>
       </w:r>
-      <w:r>
-        <w:rPr>
-          <w:rFonts w:cstheme="minorHAnsi"/>
-          <w:sz w:val="20"/>
-          <w:szCs w:val="20"/>
-        </w:rPr>
-        <w:t xml:space="preserve"> </w:t>
-      </w:r>
-      <w:r>
-        <w:rPr>
-          <w:rFonts w:cstheme="minorHAnsi"/>
-          <w:sz w:val="20"/>
-          <w:szCs w:val="20"/>
-        </w:rPr>
-        <w:t>[[</w:t>
-      </w:r>
-      <w:proofErr w:type="spellStart"/>
-      <w:r>
-        <w:rPr>
-          <w:rFonts w:cstheme="minorHAnsi"/>
-          <w:sz w:val="20"/>
-          <w:szCs w:val="20"/>
-        </w:rPr>
-        <w:t>wmtext</w:t>
-      </w:r>
-      <w:proofErr w:type="spellEnd"/>
-      <w:r>
-        <w:rPr>
-          <w:rFonts w:cstheme="minorHAnsi"/>
-          <w:sz w:val="20"/>
-          <w:szCs w:val="20"/>
-        </w:rPr>
-        <w:t xml:space="preserve"> “ ”]] [[end]]</w:t>
-      </w:r>
-    </w:p>
-    <w:p>
-      <w:pPr>
-        <w:rPr>
-          <w:rFonts w:ascii="Arial" w:hAnsi="Arial"/>
-        </w:rPr>
-      </w:pPr>
     </w:p>
     <w:sectPr>
       <w:headerReference w:type="even" r:id="rId6"/>
@@ -1181,7 +1101,7 @@
               <w:rFonts w:ascii="Arial" w:hAnsi="Arial"/>
               <w:noProof/>
             </w:rPr>
-            <w:t>9-Jun-25</w:t>
+            <w:t>17-Jul-25</w:t>
           </w:r>
           <w:r>
             <w:rPr>

</xml_diff>